<commit_message>
Tworzenie checkera sprawdzającego czy wszystkie pokoje są połączone
</commit_message>
<xml_diff>
--- a/praca_inżynierska_52753.docx
+++ b/praca_inżynierska_52753.docx
@@ -5361,18 +5361,127 @@
     </w:p>
     <w:p>
       <w:pPr>
+        <w:pStyle w:val="ListParagraph"/>
+        <w:numPr>
+          <w:ilvl w:val="0"/>
+          <w:numId w:val="35"/>
+        </w:numPr>
         <w:rPr>
           <w:color w:val="000000" w:themeColor="text1"/>
           <w:lang w:val="en-US"/>
         </w:rPr>
       </w:pPr>
+      <w:proofErr w:type="spellStart"/>
+      <w:r>
+        <w:rPr>
+          <w:color w:val="000000" w:themeColor="text1"/>
+          <w:lang w:val="en-US"/>
+        </w:rPr>
+        <w:t>GetPhysicShape</w:t>
+      </w:r>
+      <w:proofErr w:type="spellEnd"/>
+      <w:r>
+        <w:rPr>
+          <w:color w:val="000000" w:themeColor="text1"/>
+          <w:lang w:val="en-US"/>
+        </w:rPr>
+        <w:t xml:space="preserve"> - </w:t>
+      </w:r>
+      <w:hyperlink r:id="rId21" w:history="1">
+        <w:r>
+          <w:rPr>
+            <w:rStyle w:val="Hyperlink"/>
+            <w:lang w:val="en-US"/>
+          </w:rPr>
+          <w:t>https://docs.unity3d.com/6000.6/Documentation/ScriptReference/Sprite.GetPhysicsShape.html</w:t>
+        </w:r>
+      </w:hyperlink>
+    </w:p>
+    <w:p>
+      <w:pPr>
+        <w:pStyle w:val="ListParagraph"/>
+        <w:numPr>
+          <w:ilvl w:val="0"/>
+          <w:numId w:val="35"/>
+        </w:numPr>
+        <w:rPr>
+          <w:color w:val="000000" w:themeColor="text1"/>
+          <w:lang w:val="en-US"/>
+        </w:rPr>
+      </w:pPr>
+      <w:r>
+        <w:rPr>
+          <w:color w:val="000000" w:themeColor="text1"/>
+          <w:lang w:val="en-US"/>
+        </w:rPr>
+        <w:t xml:space="preserve">BFS - </w:t>
+      </w:r>
+      <w:hyperlink r:id="rId22" w:history="1">
+        <w:r>
+          <w:rPr>
+            <w:rStyle w:val="Hyperlink"/>
+            <w:lang w:val="en-US"/>
+          </w:rPr>
+          <w:t>https://stackoverflow.com/questions/5111645/breadth-first-traversal</w:t>
+        </w:r>
+      </w:hyperlink>
+    </w:p>
+    <w:p>
+      <w:pPr>
+        <w:pStyle w:val="ListParagraph"/>
+        <w:numPr>
+          <w:ilvl w:val="0"/>
+          <w:numId w:val="35"/>
+        </w:numPr>
+        <w:rPr>
+          <w:color w:val="000000" w:themeColor="text1"/>
+          <w:lang w:val="en-US"/>
+        </w:rPr>
+      </w:pPr>
+      <w:r>
+        <w:rPr>
+          <w:color w:val="000000" w:themeColor="text1"/>
+          <w:lang w:val="en-US"/>
+        </w:rPr>
+        <w:lastRenderedPageBreak/>
+        <w:t xml:space="preserve">Queue - </w:t>
+      </w:r>
+      <w:hyperlink r:id="rId23" w:history="1">
+        <w:r>
+          <w:rPr>
+            <w:rStyle w:val="Hyperlink"/>
+            <w:lang w:val="en-US"/>
+          </w:rPr>
+          <w:t>https://learn.microsoft.com/en-us/dotnet/api/system.collections.generic.queue-1?view=net-10.0</w:t>
+        </w:r>
+      </w:hyperlink>
+    </w:p>
+    <w:p>
+      <w:pPr>
+        <w:pStyle w:val="ListParagraph"/>
+        <w:numPr>
+          <w:ilvl w:val="0"/>
+          <w:numId w:val="35"/>
+        </w:numPr>
+        <w:rPr>
+          <w:color w:val="000000" w:themeColor="text1"/>
+          <w:lang w:val="en-US"/>
+        </w:rPr>
+      </w:pPr>
+    </w:p>
+    <w:p>
+      <w:pPr>
+        <w:rPr>
+          <w:color w:val="000000" w:themeColor="text1"/>
+          <w:lang w:val="en-US"/>
+        </w:rPr>
+      </w:pPr>
     </w:p>
     <w:p>
       <w:pPr>
         <w:pStyle w:val="Heading1"/>
       </w:pPr>
       <w:r>
-        <w:lastRenderedPageBreak/>
         <w:t xml:space="preserve">9. </w:t>
       </w:r>
       <w:r>
@@ -5383,7 +5492,7 @@
       <w:r>
         <w:t xml:space="preserve">Cinemachine Camera - </w:t>
       </w:r>
-      <w:hyperlink r:id="rId21" w:history="1">
+      <w:hyperlink r:id="rId24" w:history="1">
         <w:r>
           <w:rPr>
             <w:rStyle w:val="Hyperlink"/>
@@ -5402,12 +5511,12 @@
     <w:p/>
     <w:p/>
     <w:sectPr>
-      <w:headerReference w:type="even" r:id="rId22"/>
-      <w:headerReference w:type="default" r:id="rId23"/>
-      <w:footerReference w:type="even" r:id="rId24"/>
-      <w:footerReference w:type="default" r:id="rId25"/>
-      <w:headerReference w:type="first" r:id="rId26"/>
-      <w:footerReference w:type="first" r:id="rId27"/>
+      <w:headerReference w:type="even" r:id="rId25"/>
+      <w:headerReference w:type="default" r:id="rId26"/>
+      <w:footerReference w:type="even" r:id="rId27"/>
+      <w:footerReference w:type="default" r:id="rId28"/>
+      <w:headerReference w:type="first" r:id="rId29"/>
+      <w:footerReference w:type="first" r:id="rId30"/>
       <w:pgSz w:w="11906" w:h="16838" w:code="9"/>
       <w:pgMar w:top="1417" w:right="1417" w:bottom="1417" w:left="1417" w:header="567" w:footer="567" w:gutter="0"/>
       <w:cols w:space="708"/>
@@ -11570,10 +11679,6 @@
 </file>
 
 <file path=customXml/item1.xml><?xml version="1.0" encoding="utf-8"?>
-<b:Sources xmlns:b="http://schemas.openxmlformats.org/officeDocument/2006/bibliography" xmlns="http://schemas.openxmlformats.org/officeDocument/2006/bibliography" SelectedStyle="\APASixthEditionOfficeOnline.xsl" StyleName="APA" Version="6"/>
-</file>
-
-<file path=customXml/item2.xml><?xml version="1.0" encoding="utf-8"?>
 <ct:contentTypeSchema xmlns:ct="http://schemas.microsoft.com/office/2006/metadata/contentType" xmlns:ma="http://schemas.microsoft.com/office/2006/metadata/properties/metaAttributes" ct:_="" ma:_="" ma:contentTypeName="Dokument" ma:contentTypeID="0x0101002A47B328A18E094B9EF53C22F068078F" ma:contentTypeVersion="3" ma:contentTypeDescription="Utwórz nowy dokument." ma:contentTypeScope="" ma:versionID="20eeeb653e62edb580814da916af8bb2">
   <xsd:schema xmlns:xsd="http://www.w3.org/2001/XMLSchema" xmlns:xs="http://www.w3.org/2001/XMLSchema" xmlns:p="http://schemas.microsoft.com/office/2006/metadata/properties" xmlns:ns2="326803d7-d8be-486d-a084-29441079d8b7" targetNamespace="http://schemas.microsoft.com/office/2006/metadata/properties" ma:root="true" ma:fieldsID="92719727ba4d1dd87ef0f6714045b47a" ns2:_="">
     <xsd:import namespace="326803d7-d8be-486d-a084-29441079d8b7"/>
@@ -11711,13 +11816,11 @@
 </ct:contentTypeSchema>
 </file>
 
-<file path=customXml/item3.xml><?xml version="1.0" encoding="utf-8"?>
-<p:properties xmlns:p="http://schemas.microsoft.com/office/2006/metadata/properties" xmlns:xsi="http://www.w3.org/2001/XMLSchema-instance" xmlns:pc="http://schemas.microsoft.com/office/infopath/2007/PartnerControls">
-  <documentManagement/>
-</p:properties>
+<file path=customXml/item2.xml><?xml version="1.0" encoding="utf-8"?>
+<b:Sources xmlns:b="http://schemas.openxmlformats.org/officeDocument/2006/bibliography" xmlns="http://schemas.openxmlformats.org/officeDocument/2006/bibliography" SelectedStyle="\APASixthEditionOfficeOnline.xsl" StyleName="APA" Version="6"/>
 </file>
 
-<file path=customXml/item4.xml><?xml version="1.0" encoding="utf-8"?>
+<file path=customXml/item3.xml><?xml version="1.0" encoding="utf-8"?>
 <?mso-contentType ?>
 <FormTemplates xmlns="http://schemas.microsoft.com/sharepoint/v3/contenttype/forms">
   <Display>DocumentLibraryForm</Display>
@@ -11726,15 +11829,13 @@
 </FormTemplates>
 </file>
 
-<file path=customXml/itemProps1.xml><?xml version="1.0" encoding="utf-8"?>
-<ds:datastoreItem xmlns:ds="http://schemas.openxmlformats.org/officeDocument/2006/customXml" ds:itemID="{06BF7A6E-5245-4FAA-8155-32709F41727B}">
-  <ds:schemaRefs>
-    <ds:schemaRef ds:uri="http://schemas.openxmlformats.org/officeDocument/2006/bibliography"/>
-  </ds:schemaRefs>
-</ds:datastoreItem>
+<file path=customXml/item4.xml><?xml version="1.0" encoding="utf-8"?>
+<p:properties xmlns:p="http://schemas.microsoft.com/office/2006/metadata/properties" xmlns:xsi="http://www.w3.org/2001/XMLSchema-instance" xmlns:pc="http://schemas.microsoft.com/office/infopath/2007/PartnerControls">
+  <documentManagement/>
+</p:properties>
 </file>
 
-<file path=customXml/itemProps2.xml><?xml version="1.0" encoding="utf-8"?>
+<file path=customXml/itemProps1.xml><?xml version="1.0" encoding="utf-8"?>
 <ds:datastoreItem xmlns:ds="http://schemas.openxmlformats.org/officeDocument/2006/customXml" ds:itemID="{6C62FD72-4AE9-48D1-9079-FE9F7C350712}">
   <ds:schemaRefs>
     <ds:schemaRef ds:uri="http://schemas.microsoft.com/office/2006/metadata/contentType"/>
@@ -11752,19 +11853,27 @@
 </ds:datastoreItem>
 </file>
 
+<file path=customXml/itemProps2.xml><?xml version="1.0" encoding="utf-8"?>
+<ds:datastoreItem xmlns:ds="http://schemas.openxmlformats.org/officeDocument/2006/customXml" ds:itemID="{06BF7A6E-5245-4FAA-8155-32709F41727B}">
+  <ds:schemaRefs>
+    <ds:schemaRef ds:uri="http://schemas.openxmlformats.org/officeDocument/2006/bibliography"/>
+  </ds:schemaRefs>
+</ds:datastoreItem>
+</file>
+
 <file path=customXml/itemProps3.xml><?xml version="1.0" encoding="utf-8"?>
+<ds:datastoreItem xmlns:ds="http://schemas.openxmlformats.org/officeDocument/2006/customXml" ds:itemID="{E98FCB9D-D551-4249-9F65-3A504ED32D36}">
+  <ds:schemaRefs>
+    <ds:schemaRef ds:uri="http://schemas.microsoft.com/sharepoint/v3/contenttype/forms"/>
+  </ds:schemaRefs>
+</ds:datastoreItem>
+</file>
+
+<file path=customXml/itemProps4.xml><?xml version="1.0" encoding="utf-8"?>
 <ds:datastoreItem xmlns:ds="http://schemas.openxmlformats.org/officeDocument/2006/customXml" ds:itemID="{D47433C4-7F90-48A4-AF53-D7EE7E4EDE32}">
   <ds:schemaRefs>
     <ds:schemaRef ds:uri="http://schemas.microsoft.com/office/2006/metadata/properties"/>
     <ds:schemaRef ds:uri="http://schemas.microsoft.com/office/infopath/2007/PartnerControls"/>
   </ds:schemaRefs>
 </ds:datastoreItem>
-</file>
-
-<file path=customXml/itemProps4.xml><?xml version="1.0" encoding="utf-8"?>
-<ds:datastoreItem xmlns:ds="http://schemas.openxmlformats.org/officeDocument/2006/customXml" ds:itemID="{E98FCB9D-D551-4249-9F65-3A504ED32D36}">
-  <ds:schemaRefs>
-    <ds:schemaRef ds:uri="http://schemas.microsoft.com/sharepoint/v3/contenttype/forms"/>
-  </ds:schemaRefs>
-</ds:datastoreItem>
 </file>
</xml_diff>

<commit_message>
save/load basics - 3 hours and it does not work
</commit_message>
<xml_diff>
--- a/praca_inżynierska_52753.docx
+++ b/praca_inżynierska_52753.docx
@@ -6374,21 +6374,12 @@
           <w:lang w:val="en-US"/>
         </w:rPr>
       </w:pPr>
-      <w:proofErr w:type="gramStart"/>
       <w:r>
         <w:rPr>
           <w:color w:val="000000" w:themeColor="text1"/>
           <w:lang w:val="en-US"/>
         </w:rPr>
-        <w:t>LINQ  “Where(</w:t>
-      </w:r>
-      <w:proofErr w:type="gramEnd"/>
-      <w:r>
-        <w:rPr>
-          <w:color w:val="000000" w:themeColor="text1"/>
-          <w:lang w:val="en-US"/>
-        </w:rPr>
-        <w:t xml:space="preserve">)” - </w:t>
+        <w:t xml:space="preserve">LINQ  “Where()” - </w:t>
       </w:r>
       <w:hyperlink r:id="rId25" w:history="1">
         <w:r>
@@ -6417,23 +6408,7 @@
           <w:color w:val="000000" w:themeColor="text1"/>
           <w:lang w:val="en-US"/>
         </w:rPr>
-        <w:t>LINQ custom “</w:t>
-      </w:r>
-      <w:proofErr w:type="gramStart"/>
-      <w:r>
-        <w:rPr>
-          <w:color w:val="000000" w:themeColor="text1"/>
-          <w:lang w:val="en-US"/>
-        </w:rPr>
-        <w:t>None()”Function</w:t>
-      </w:r>
-      <w:proofErr w:type="gramEnd"/>
-      <w:r>
-        <w:rPr>
-          <w:color w:val="000000" w:themeColor="text1"/>
-          <w:lang w:val="en-US"/>
-        </w:rPr>
-        <w:t xml:space="preserve"> - </w:t>
+        <w:t xml:space="preserve">LINQ custom “None()”Function - </w:t>
       </w:r>
       <w:hyperlink r:id="rId26" w:history="1">
         <w:r>
@@ -6528,58 +6503,167 @@
           <w:lang w:val="en-US"/>
         </w:rPr>
       </w:pPr>
-    </w:p>
-    <w:p>
-      <w:pPr>
+      <w:proofErr w:type="spellStart"/>
+      <w:r>
         <w:rPr>
           <w:color w:val="000000" w:themeColor="text1"/>
           <w:lang w:val="en-US"/>
         </w:rPr>
-      </w:pPr>
-    </w:p>
-    <w:p>
-      <w:pPr>
-        <w:pStyle w:val="Heading1"/>
-      </w:pPr>
-      <w:bookmarkStart w:id="24" w:name="_Toc241337450"/>
-      <w:r>
-        <w:lastRenderedPageBreak/>
-        <w:t xml:space="preserve">9. </w:t>
-      </w:r>
-      <w:r>
-        <w:t>Pakiety i inne źródła</w:t>
-      </w:r>
-      <w:bookmarkEnd w:id="24"/>
-    </w:p>
-    <w:p>
-      <w:r>
-        <w:t xml:space="preserve">Cinemachine Camera - </w:t>
+        <w:t>System.IO.File</w:t>
+      </w:r>
+      <w:proofErr w:type="spellEnd"/>
+      <w:r>
+        <w:rPr>
+          <w:color w:val="000000" w:themeColor="text1"/>
+          <w:lang w:val="en-US"/>
+        </w:rPr>
+        <w:t xml:space="preserve"> - </w:t>
       </w:r>
       <w:hyperlink r:id="rId29" w:history="1">
         <w:r>
           <w:rPr>
             <w:rStyle w:val="Hyperlink"/>
+            <w:lang w:val="en-US"/>
+          </w:rPr>
+          <w:t>https://learn.microsoft.com/en-us/dotnet/api/system.io.file?view=net-10.0</w:t>
+        </w:r>
+      </w:hyperlink>
+    </w:p>
+    <w:p>
+      <w:pPr>
+        <w:pStyle w:val="ListParagraph"/>
+        <w:numPr>
+          <w:ilvl w:val="0"/>
+          <w:numId w:val="35"/>
+        </w:numPr>
+        <w:rPr>
+          <w:color w:val="000000" w:themeColor="text1"/>
+          <w:lang w:val="en-US"/>
+        </w:rPr>
+      </w:pPr>
+    </w:p>
+    <w:p>
+      <w:pPr>
+        <w:rPr>
+          <w:color w:val="000000" w:themeColor="text1"/>
+          <w:lang w:val="en-US"/>
+        </w:rPr>
+      </w:pPr>
+    </w:p>
+    <w:p>
+      <w:pPr>
+        <w:pStyle w:val="Heading1"/>
+      </w:pPr>
+      <w:bookmarkStart w:id="24" w:name="_Toc241337450"/>
+      <w:r>
+        <w:lastRenderedPageBreak/>
+        <w:t xml:space="preserve">9. </w:t>
+      </w:r>
+      <w:r>
+        <w:t>Pakiety i inne źródła</w:t>
+      </w:r>
+      <w:bookmarkEnd w:id="24"/>
+    </w:p>
+    <w:p>
+      <w:pPr>
+        <w:rPr>
+          <w:lang w:val="en-US"/>
+        </w:rPr>
+      </w:pPr>
+      <w:proofErr w:type="spellStart"/>
+      <w:r>
+        <w:rPr>
+          <w:lang w:val="en-US"/>
+        </w:rPr>
+        <w:t>Cinemachine</w:t>
+      </w:r>
+      <w:proofErr w:type="spellEnd"/>
+      <w:r>
+        <w:rPr>
+          <w:lang w:val="en-US"/>
+        </w:rPr>
+        <w:t xml:space="preserve"> Camera - </w:t>
+      </w:r>
+      <w:hyperlink r:id="rId30" w:history="1">
+        <w:r>
+          <w:rPr>
+            <w:rStyle w:val="Hyperlink"/>
+            <w:lang w:val="en-US"/>
           </w:rPr>
           <w:t>https://docs.unity3d.com/Packages/com.unity.cinemachine@6.6/manual/index.html</w:t>
         </w:r>
       </w:hyperlink>
     </w:p>
-    <w:p/>
-    <w:p/>
-    <w:p/>
-    <w:p/>
-    <w:p/>
-    <w:p/>
-    <w:p/>
-    <w:p/>
-    <w:p/>
+    <w:p>
+      <w:pPr>
+        <w:rPr>
+          <w:lang w:val="en-US"/>
+        </w:rPr>
+      </w:pPr>
+    </w:p>
+    <w:p>
+      <w:pPr>
+        <w:rPr>
+          <w:lang w:val="en-US"/>
+        </w:rPr>
+      </w:pPr>
+    </w:p>
+    <w:p>
+      <w:pPr>
+        <w:rPr>
+          <w:lang w:val="en-US"/>
+        </w:rPr>
+      </w:pPr>
+    </w:p>
+    <w:p>
+      <w:pPr>
+        <w:rPr>
+          <w:lang w:val="en-US"/>
+        </w:rPr>
+      </w:pPr>
+    </w:p>
+    <w:p>
+      <w:pPr>
+        <w:rPr>
+          <w:lang w:val="en-US"/>
+        </w:rPr>
+      </w:pPr>
+    </w:p>
+    <w:p>
+      <w:pPr>
+        <w:rPr>
+          <w:lang w:val="en-US"/>
+        </w:rPr>
+      </w:pPr>
+    </w:p>
+    <w:p>
+      <w:pPr>
+        <w:rPr>
+          <w:lang w:val="en-US"/>
+        </w:rPr>
+      </w:pPr>
+    </w:p>
+    <w:p>
+      <w:pPr>
+        <w:rPr>
+          <w:lang w:val="en-US"/>
+        </w:rPr>
+      </w:pPr>
+    </w:p>
+    <w:p>
+      <w:pPr>
+        <w:rPr>
+          <w:lang w:val="en-US"/>
+        </w:rPr>
+      </w:pPr>
+    </w:p>
     <w:sectPr>
-      <w:headerReference w:type="even" r:id="rId30"/>
-      <w:headerReference w:type="default" r:id="rId31"/>
-      <w:footerReference w:type="even" r:id="rId32"/>
-      <w:footerReference w:type="default" r:id="rId33"/>
-      <w:headerReference w:type="first" r:id="rId34"/>
-      <w:footerReference w:type="first" r:id="rId35"/>
+      <w:headerReference w:type="even" r:id="rId31"/>
+      <w:headerReference w:type="default" r:id="rId32"/>
+      <w:footerReference w:type="even" r:id="rId33"/>
+      <w:footerReference w:type="default" r:id="rId34"/>
+      <w:headerReference w:type="first" r:id="rId35"/>
+      <w:footerReference w:type="first" r:id="rId36"/>
       <w:pgSz w:w="11906" w:h="16838" w:code="9"/>
       <w:pgMar w:top="1417" w:right="1417" w:bottom="1417" w:left="1417" w:header="567" w:footer="567" w:gutter="0"/>
       <w:cols w:space="708"/>
@@ -12772,6 +12856,10 @@
 </file>
 
 <file path=customXml/item1.xml><?xml version="1.0" encoding="utf-8"?>
+<b:Sources xmlns:b="http://schemas.openxmlformats.org/officeDocument/2006/bibliography" xmlns="http://schemas.openxmlformats.org/officeDocument/2006/bibliography" SelectedStyle="\APASixthEditionOfficeOnline.xsl" StyleName="APA" Version="6"/>
+</file>
+
+<file path=customXml/item2.xml><?xml version="1.0" encoding="utf-8"?>
 <ct:contentTypeSchema xmlns:ct="http://schemas.microsoft.com/office/2006/metadata/contentType" xmlns:ma="http://schemas.microsoft.com/office/2006/metadata/properties/metaAttributes" ct:_="" ma:_="" ma:contentTypeName="Dokument" ma:contentTypeID="0x0101002A47B328A18E094B9EF53C22F068078F" ma:contentTypeVersion="3" ma:contentTypeDescription="Utwórz nowy dokument." ma:contentTypeScope="" ma:versionID="20eeeb653e62edb580814da916af8bb2">
   <xsd:schema xmlns:xsd="http://www.w3.org/2001/XMLSchema" xmlns:xs="http://www.w3.org/2001/XMLSchema" xmlns:p="http://schemas.microsoft.com/office/2006/metadata/properties" xmlns:ns2="326803d7-d8be-486d-a084-29441079d8b7" targetNamespace="http://schemas.microsoft.com/office/2006/metadata/properties" ma:root="true" ma:fieldsID="92719727ba4d1dd87ef0f6714045b47a" ns2:_="">
     <xsd:import namespace="326803d7-d8be-486d-a084-29441079d8b7"/>
@@ -12909,11 +12997,13 @@
 </ct:contentTypeSchema>
 </file>
 
-<file path=customXml/item2.xml><?xml version="1.0" encoding="utf-8"?>
-<b:Sources xmlns:b="http://schemas.openxmlformats.org/officeDocument/2006/bibliography" xmlns="http://schemas.openxmlformats.org/officeDocument/2006/bibliography" SelectedStyle="\APASixthEditionOfficeOnline.xsl" StyleName="APA" Version="6"/>
+<file path=customXml/item3.xml><?xml version="1.0" encoding="utf-8"?>
+<p:properties xmlns:p="http://schemas.microsoft.com/office/2006/metadata/properties" xmlns:xsi="http://www.w3.org/2001/XMLSchema-instance" xmlns:pc="http://schemas.microsoft.com/office/infopath/2007/PartnerControls">
+  <documentManagement/>
+</p:properties>
 </file>
 
-<file path=customXml/item3.xml><?xml version="1.0" encoding="utf-8"?>
+<file path=customXml/item4.xml><?xml version="1.0" encoding="utf-8"?>
 <?mso-contentType ?>
 <FormTemplates xmlns="http://schemas.microsoft.com/sharepoint/v3/contenttype/forms">
   <Display>DocumentLibraryForm</Display>
@@ -12922,13 +13012,15 @@
 </FormTemplates>
 </file>
 
-<file path=customXml/item4.xml><?xml version="1.0" encoding="utf-8"?>
-<p:properties xmlns:p="http://schemas.microsoft.com/office/2006/metadata/properties" xmlns:xsi="http://www.w3.org/2001/XMLSchema-instance" xmlns:pc="http://schemas.microsoft.com/office/infopath/2007/PartnerControls">
-  <documentManagement/>
-</p:properties>
+<file path=customXml/itemProps1.xml><?xml version="1.0" encoding="utf-8"?>
+<ds:datastoreItem xmlns:ds="http://schemas.openxmlformats.org/officeDocument/2006/customXml" ds:itemID="{06BF7A6E-5245-4FAA-8155-32709F41727B}">
+  <ds:schemaRefs>
+    <ds:schemaRef ds:uri="http://schemas.openxmlformats.org/officeDocument/2006/bibliography"/>
+  </ds:schemaRefs>
+</ds:datastoreItem>
 </file>
 
-<file path=customXml/itemProps1.xml><?xml version="1.0" encoding="utf-8"?>
+<file path=customXml/itemProps2.xml><?xml version="1.0" encoding="utf-8"?>
 <ds:datastoreItem xmlns:ds="http://schemas.openxmlformats.org/officeDocument/2006/customXml" ds:itemID="{6C62FD72-4AE9-48D1-9079-FE9F7C350712}">
   <ds:schemaRefs>
     <ds:schemaRef ds:uri="http://schemas.microsoft.com/office/2006/metadata/contentType"/>
@@ -12946,27 +13038,19 @@
 </ds:datastoreItem>
 </file>
 
-<file path=customXml/itemProps2.xml><?xml version="1.0" encoding="utf-8"?>
-<ds:datastoreItem xmlns:ds="http://schemas.openxmlformats.org/officeDocument/2006/customXml" ds:itemID="{06BF7A6E-5245-4FAA-8155-32709F41727B}">
-  <ds:schemaRefs>
-    <ds:schemaRef ds:uri="http://schemas.openxmlformats.org/officeDocument/2006/bibliography"/>
-  </ds:schemaRefs>
-</ds:datastoreItem>
-</file>
-
 <file path=customXml/itemProps3.xml><?xml version="1.0" encoding="utf-8"?>
-<ds:datastoreItem xmlns:ds="http://schemas.openxmlformats.org/officeDocument/2006/customXml" ds:itemID="{E98FCB9D-D551-4249-9F65-3A504ED32D36}">
-  <ds:schemaRefs>
-    <ds:schemaRef ds:uri="http://schemas.microsoft.com/sharepoint/v3/contenttype/forms"/>
-  </ds:schemaRefs>
-</ds:datastoreItem>
-</file>
-
-<file path=customXml/itemProps4.xml><?xml version="1.0" encoding="utf-8"?>
 <ds:datastoreItem xmlns:ds="http://schemas.openxmlformats.org/officeDocument/2006/customXml" ds:itemID="{D47433C4-7F90-48A4-AF53-D7EE7E4EDE32}">
   <ds:schemaRefs>
     <ds:schemaRef ds:uri="http://schemas.microsoft.com/office/2006/metadata/properties"/>
     <ds:schemaRef ds:uri="http://schemas.microsoft.com/office/infopath/2007/PartnerControls"/>
   </ds:schemaRefs>
 </ds:datastoreItem>
+</file>
+
+<file path=customXml/itemProps4.xml><?xml version="1.0" encoding="utf-8"?>
+<ds:datastoreItem xmlns:ds="http://schemas.openxmlformats.org/officeDocument/2006/customXml" ds:itemID="{E98FCB9D-D551-4249-9F65-3A504ED32D36}">
+  <ds:schemaRefs>
+    <ds:schemaRef ds:uri="http://schemas.microsoft.com/sharepoint/v3/contenttype/forms"/>
+  </ds:schemaRefs>
+</ds:datastoreItem>
 </file>
</xml_diff>